<commit_message>
Finalize summary table tail sections and HOW TO USE THIS TABLE header
- build_summary_table_docx(): renamed Instructions header to
  "HOW TO USE THIS TABLE"
- Added End-of-Unit Reflection Questions, DQB and Model Tracking,
  and Teacher Notes sections after main summary table (all parsed
  from source documents)
- Regenerated all 9 output files

https://claude.ai/code/session_01J9jEA4DnFx8YWZJcajHJKQ
</commit_message>
<xml_diff>
--- a/data/outputs/Seavuria_Reformatted/Chemistry_10_SubStrand1.4_ChemicalBonding_SummaryTable.docx
+++ b/data/outputs/Seavuria_Reformatted/Chemistry_10_SubStrand1.4_ChemicalBonding_SummaryTable.docx
@@ -375,7 +375,7 @@
                 <w:color w:val="FFFFFF"/>
                 <w:sz w:val="22"/>
               </w:rPr>
-              <w:t>INSTRUCTIONS</w:t>
+              <w:t>HOW TO USE THIS TABLE</w:t>
             </w:r>
           </w:p>
         </w:tc>
@@ -2097,6 +2097,591 @@
         </w:tc>
       </w:tr>
     </w:tbl>
+    <w:p>
+      <w:pPr>
+        <w:spacing w:before="0" w:after="0"/>
+        <w:spacing w:before="0" w:after="0" w:line="240" w:lineRule="auto"/>
+      </w:pPr>
+    </w:p>
+    <w:tbl>
+      <w:tblPr>
+        <w:tblW w:type="auto" w:w="0"/>
+        <w:jc w:val="left"/>
+        <w:tblLook w:firstColumn="1" w:firstRow="1" w:lastColumn="0" w:lastRow="0" w:noHBand="0" w:noVBand="1" w:val="04A0"/>
+        <w:tblBorders>
+          <w:top w:val="single" w:sz="4" w:space="0" w:color="000000"/>
+          <w:left w:val="single" w:sz="4" w:space="0" w:color="000000"/>
+          <w:bottom w:val="single" w:sz="4" w:space="0" w:color="000000"/>
+          <w:right w:val="single" w:sz="4" w:space="0" w:color="000000"/>
+          <w:insideH w:val="single" w:sz="4" w:space="0" w:color="000000"/>
+          <w:insideV w:val="single" w:sz="4" w:space="0" w:color="000000"/>
+        </w:tblBorders>
+      </w:tblPr>
+      <w:tblGrid>
+        <w:gridCol w:w="13680"/>
+      </w:tblGrid>
+      <w:tr>
+        <w:tc>
+          <w:tcPr>
+            <w:tcW w:type="dxa" w:w="13680"/>
+            <w:shd w:val="clear" w:color="auto" w:fill="2E75B6"/>
+          </w:tcPr>
+          <w:p>
+            <w:pPr>
+              <w:spacing w:before="40" w:after="40"/>
+              <w:jc w:val="left"/>
+            </w:pPr>
+            <w:r>
+              <w:rPr>
+                <w:rFonts w:ascii="Arial" w:hAnsi="Arial"/>
+                <w:b/>
+                <w:i w:val="0"/>
+                <w:color w:val="FFFFFF"/>
+                <w:sz w:val="22"/>
+              </w:rPr>
+              <w:t>END-OF-UNIT REFLECTION QUESTIONS</w:t>
+            </w:r>
+          </w:p>
+        </w:tc>
+      </w:tr>
+      <w:tr>
+        <w:tc>
+          <w:tcPr>
+            <w:tcW w:type="dxa" w:w="13680"/>
+            <w:shd w:val="clear" w:color="auto" w:fill="FFFFFF"/>
+          </w:tcPr>
+          <w:p>
+            <w:pPr>
+              <w:spacing w:before="20" w:after="20"/>
+              <w:jc w:val="left"/>
+            </w:pPr>
+            <w:r>
+              <w:rPr>
+                <w:rFonts w:ascii="Arial" w:hAnsi="Arial"/>
+                <w:b w:val="0"/>
+                <w:i w:val="0"/>
+                <w:color w:val="000000"/>
+                <w:sz w:val="18"/>
+              </w:rPr>
+              <w:t>After completing all 13 lessons, respond to these questions to synthesize your learning:</w:t>
+            </w:r>
+          </w:p>
+          <w:p>
+            <w:pPr>
+              <w:spacing w:before="20" w:after="20"/>
+              <w:jc w:val="left"/>
+            </w:pPr>
+            <w:r>
+              <w:rPr>
+                <w:rFonts w:ascii="Arial" w:hAnsi="Arial"/>
+                <w:b/>
+                <w:i w:val="0"/>
+                <w:color w:val="000000"/>
+                <w:sz w:val="18"/>
+              </w:rPr>
+              <w:t>1. How has your understanding of chemical bonding changed from Lesson 1 to Lesson 13?</w:t>
+            </w:r>
+          </w:p>
+          <w:p>
+            <w:pPr>
+              <w:spacing w:before="20" w:after="20"/>
+              <w:jc w:val="left"/>
+            </w:pPr>
+            <w:r>
+              <w:rPr>
+                <w:rFonts w:ascii="Arial" w:hAnsi="Arial"/>
+                <w:b w:val="0"/>
+                <w:i w:val="0"/>
+                <w:color w:val="000000"/>
+                <w:sz w:val="18"/>
+              </w:rPr>
+              <w:t>Reflect on your initial ideas versus your final understanding. What were the biggest shifts in your thinking?</w:t>
+            </w:r>
+          </w:p>
+          <w:p>
+            <w:pPr>
+              <w:spacing w:before="20" w:after="20"/>
+              <w:jc w:val="left"/>
+            </w:pPr>
+            <w:r>
+              <w:rPr>
+                <w:rFonts w:ascii="Arial" w:hAnsi="Arial"/>
+                <w:b/>
+                <w:i w:val="0"/>
+                <w:color w:val="000000"/>
+                <w:sz w:val="18"/>
+              </w:rPr>
+              <w:t>2. What evidence was most important in helping you explain the diamond/graphite phenomenon?</w:t>
+            </w:r>
+          </w:p>
+          <w:p>
+            <w:pPr>
+              <w:spacing w:before="20" w:after="20"/>
+              <w:jc w:val="left"/>
+            </w:pPr>
+            <w:r>
+              <w:rPr>
+                <w:rFonts w:ascii="Arial" w:hAnsi="Arial"/>
+                <w:b w:val="0"/>
+                <w:i w:val="0"/>
+                <w:color w:val="000000"/>
+                <w:sz w:val="18"/>
+              </w:rPr>
+              <w:t>Identify 2-3 key investigations or pieces of data that were crucial to your understanding.</w:t>
+            </w:r>
+          </w:p>
+          <w:p>
+            <w:pPr>
+              <w:spacing w:before="20" w:after="20"/>
+              <w:jc w:val="left"/>
+            </w:pPr>
+            <w:r>
+              <w:rPr>
+                <w:rFonts w:ascii="Arial" w:hAnsi="Arial"/>
+                <w:b/>
+                <w:i w:val="0"/>
+                <w:color w:val="000000"/>
+                <w:sz w:val="18"/>
+              </w:rPr>
+              <w:t>3. How do the bonds between atoms determine the properties and uses of substances?</w:t>
+            </w:r>
+          </w:p>
+          <w:p>
+            <w:pPr>
+              <w:spacing w:before="20" w:after="20"/>
+              <w:jc w:val="left"/>
+            </w:pPr>
+            <w:r>
+              <w:rPr>
+                <w:rFonts w:ascii="Arial" w:hAnsi="Arial"/>
+                <w:b w:val="0"/>
+                <w:i w:val="0"/>
+                <w:color w:val="000000"/>
+                <w:sz w:val="18"/>
+              </w:rPr>
+              <w:t>Provide a comprehensive answer to the driving question, using specific examples from the unit.</w:t>
+            </w:r>
+          </w:p>
+          <w:p>
+            <w:pPr>
+              <w:spacing w:before="20" w:after="20"/>
+              <w:jc w:val="left"/>
+            </w:pPr>
+            <w:r>
+              <w:rPr>
+                <w:rFonts w:ascii="Arial" w:hAnsi="Arial"/>
+                <w:b/>
+                <w:i w:val="0"/>
+                <w:color w:val="000000"/>
+                <w:sz w:val="18"/>
+              </w:rPr>
+              <w:t>4. What patterns did you notice about how different types of bonding (ionic, covalent, metallic) relate to substance properties?</w:t>
+            </w:r>
+          </w:p>
+          <w:p>
+            <w:pPr>
+              <w:spacing w:before="20" w:after="20"/>
+              <w:jc w:val="left"/>
+            </w:pPr>
+            <w:r>
+              <w:rPr>
+                <w:rFonts w:ascii="Arial" w:hAnsi="Arial"/>
+                <w:b w:val="0"/>
+                <w:i w:val="0"/>
+                <w:color w:val="000000"/>
+                <w:sz w:val="18"/>
+              </w:rPr>
+              <w:t>Describe the relationships you discovered between bond type, structure, and observable properties.</w:t>
+            </w:r>
+          </w:p>
+          <w:p>
+            <w:pPr>
+              <w:spacing w:before="20" w:after="20"/>
+              <w:jc w:val="left"/>
+            </w:pPr>
+            <w:r>
+              <w:rPr>
+                <w:rFonts w:ascii="Arial" w:hAnsi="Arial"/>
+                <w:b/>
+                <w:i w:val="0"/>
+                <w:color w:val="000000"/>
+                <w:sz w:val="18"/>
+              </w:rPr>
+              <w:t>5. If you had to explain chemical bonding to a Grade 8 student, what would be the three most important ideas you would share?</w:t>
+            </w:r>
+          </w:p>
+          <w:p>
+            <w:pPr>
+              <w:spacing w:before="20" w:after="20"/>
+              <w:jc w:val="left"/>
+            </w:pPr>
+            <w:r>
+              <w:rPr>
+                <w:rFonts w:ascii="Arial" w:hAnsi="Arial"/>
+                <w:b w:val="0"/>
+                <w:i w:val="0"/>
+                <w:color w:val="000000"/>
+                <w:sz w:val="18"/>
+              </w:rPr>
+              <w:t>Distill your learning into the core concepts that matter most.</w:t>
+            </w:r>
+          </w:p>
+          <w:p>
+            <w:pPr>
+              <w:spacing w:before="20" w:after="20"/>
+              <w:jc w:val="left"/>
+            </w:pPr>
+            <w:r>
+              <w:rPr>
+                <w:rFonts w:ascii="Arial" w:hAnsi="Arial"/>
+                <w:b/>
+                <w:i w:val="0"/>
+                <w:color w:val="000000"/>
+                <w:sz w:val="18"/>
+              </w:rPr>
+              <w:t>6. What new questions do you have about chemical bonding or materials science?</w:t>
+            </w:r>
+          </w:p>
+          <w:p>
+            <w:pPr>
+              <w:spacing w:before="20" w:after="20"/>
+              <w:jc w:val="left"/>
+            </w:pPr>
+            <w:r>
+              <w:rPr>
+                <w:rFonts w:ascii="Arial" w:hAnsi="Arial"/>
+                <w:b w:val="0"/>
+                <w:i w:val="0"/>
+                <w:color w:val="000000"/>
+                <w:sz w:val="18"/>
+              </w:rPr>
+              <w:t>What do you want to learn next? What puzzles remain?</w:t>
+            </w:r>
+          </w:p>
+        </w:tc>
+      </w:tr>
+    </w:tbl>
+    <w:p>
+      <w:pPr>
+        <w:spacing w:before="0" w:after="0"/>
+        <w:spacing w:before="0" w:after="0" w:line="240" w:lineRule="auto"/>
+      </w:pPr>
+    </w:p>
+    <w:tbl>
+      <w:tblPr>
+        <w:tblW w:type="auto" w:w="0"/>
+        <w:jc w:val="left"/>
+        <w:tblLook w:firstColumn="1" w:firstRow="1" w:lastColumn="0" w:lastRow="0" w:noHBand="0" w:noVBand="1" w:val="04A0"/>
+        <w:tblBorders>
+          <w:top w:val="single" w:sz="4" w:space="0" w:color="000000"/>
+          <w:left w:val="single" w:sz="4" w:space="0" w:color="000000"/>
+          <w:bottom w:val="single" w:sz="4" w:space="0" w:color="000000"/>
+          <w:right w:val="single" w:sz="4" w:space="0" w:color="000000"/>
+          <w:insideH w:val="single" w:sz="4" w:space="0" w:color="000000"/>
+          <w:insideV w:val="single" w:sz="4" w:space="0" w:color="000000"/>
+        </w:tblBorders>
+      </w:tblPr>
+      <w:tblGrid>
+        <w:gridCol w:w="13680"/>
+      </w:tblGrid>
+      <w:tr>
+        <w:tc>
+          <w:tcPr>
+            <w:tcW w:type="dxa" w:w="13680"/>
+            <w:shd w:val="clear" w:color="auto" w:fill="1F3864"/>
+          </w:tcPr>
+          <w:p>
+            <w:pPr>
+              <w:spacing w:before="40" w:after="40"/>
+              <w:jc w:val="left"/>
+            </w:pPr>
+            <w:r>
+              <w:rPr>
+                <w:rFonts w:ascii="Arial" w:hAnsi="Arial"/>
+                <w:b/>
+                <w:i w:val="0"/>
+                <w:color w:val="FFFFFF"/>
+                <w:sz w:val="22"/>
+              </w:rPr>
+              <w:t>TEACHER NOTES: FORMATIVE USE OF THIS TABLE</w:t>
+            </w:r>
+          </w:p>
+        </w:tc>
+      </w:tr>
+      <w:tr>
+        <w:tc>
+          <w:tcPr>
+            <w:tcW w:type="dxa" w:w="13680"/>
+            <w:shd w:val="clear" w:color="auto" w:fill="FFFFFF"/>
+          </w:tcPr>
+          <w:p>
+            <w:pPr>
+              <w:spacing w:before="20" w:after="20"/>
+              <w:jc w:val="left"/>
+            </w:pPr>
+            <w:r>
+              <w:rPr>
+                <w:rFonts w:ascii="Arial" w:hAnsi="Arial"/>
+                <w:b/>
+                <w:i w:val="0"/>
+                <w:color w:val="000000"/>
+                <w:sz w:val="18"/>
+              </w:rPr>
+              <w:t>Purpose and Pedagogical Rationale</w:t>
+            </w:r>
+          </w:p>
+          <w:p>
+            <w:pPr>
+              <w:spacing w:before="20" w:after="20"/>
+              <w:jc w:val="left"/>
+            </w:pPr>
+            <w:r>
+              <w:rPr>
+                <w:rFonts w:ascii="Arial" w:hAnsi="Arial"/>
+                <w:b w:val="0"/>
+                <w:i w:val="0"/>
+                <w:color w:val="000000"/>
+                <w:sz w:val="18"/>
+              </w:rPr>
+              <w:t>This Summary Table serves as a metacognitive scaffold and formative assessment tool that makes student thinking visible throughout the unit. It supports the three-dimensional learning goals of NGSS-aligned instruction by helping students integrate disciplinary core ideas (chemical bonding), science practices (modeling, argumentation), and crosscutting concepts (structure-function relationships).</w:t>
+            </w:r>
+          </w:p>
+          <w:p>
+            <w:pPr>
+              <w:spacing w:before="20" w:after="20"/>
+              <w:jc w:val="left"/>
+            </w:pPr>
+            <w:r>
+              <w:rPr>
+                <w:rFonts w:ascii="Arial" w:hAnsi="Arial"/>
+                <w:b/>
+                <w:i w:val="0"/>
+                <w:color w:val="000000"/>
+                <w:sz w:val="18"/>
+              </w:rPr>
+              <w:t>Formative Assessment Strategies</w:t>
+            </w:r>
+          </w:p>
+          <w:p>
+            <w:pPr>
+              <w:spacing w:before="20" w:after="20"/>
+              <w:jc w:val="left"/>
+            </w:pPr>
+            <w:r>
+              <w:rPr>
+                <w:rFonts w:ascii="Arial" w:hAnsi="Arial"/>
+                <w:b w:val="0"/>
+                <w:i w:val="0"/>
+                <w:color w:val="000000"/>
+                <w:sz w:val="18"/>
+              </w:rPr>
+              <w:t>1. Regular Check-ins (Every 2-3 Lessons) - Collect or review tables to identify: - Students who are making connections vs. those providing surface-level responses - Common misconceptions about bonding, electron behavior, or structure-property relationships - Questions on the DQB that signal productive confusion vs. fundamental misunderstandings</w:t>
+            </w:r>
+          </w:p>
+          <w:p>
+            <w:pPr>
+              <w:spacing w:before="20" w:after="20"/>
+              <w:jc w:val="left"/>
+            </w:pPr>
+            <w:r>
+              <w:rPr>
+                <w:rFonts w:ascii="Arial" w:hAnsi="Arial"/>
+                <w:b w:val="0"/>
+                <w:i w:val="0"/>
+                <w:color w:val="000000"/>
+                <w:sz w:val="18"/>
+              </w:rPr>
+              <w:t>2. Look-Fors in Student Responses</w:t>
+            </w:r>
+          </w:p>
+          <w:p>
+            <w:pPr>
+              <w:spacing w:before="20" w:after="20"/>
+              <w:jc w:val="left"/>
+            </w:pPr>
+            <w:r>
+              <w:rPr>
+                <w:rFonts w:ascii="Arial" w:hAnsi="Arial"/>
+                <w:b w:val="0"/>
+                <w:i w:val="0"/>
+                <w:color w:val="000000"/>
+                <w:sz w:val="18"/>
+              </w:rPr>
+              <w:t>3. Differentiation Opportunities - Struggling learners: Provide sentence frames, word banks, or partially completed rows - Advanced learners: Challenge them to identify limitations in their models or propose alternative explanations - ELL support: Allow drawings, diagrams, or native language notes alongside English text</w:t>
+            </w:r>
+          </w:p>
+          <w:p>
+            <w:pPr>
+              <w:spacing w:before="20" w:after="20"/>
+              <w:jc w:val="left"/>
+            </w:pPr>
+            <w:r>
+              <w:rPr>
+                <w:rFonts w:ascii="Arial" w:hAnsi="Arial"/>
+                <w:b w:val="0"/>
+                <w:i w:val="0"/>
+                <w:color w:val="000000"/>
+                <w:sz w:val="18"/>
+              </w:rPr>
+              <w:t>4. Instructional Adjustments Use table data to: - Re-teach concepts if multiple students show the same misconception - Adjust pacing if students aren’t making connections across lessons - Highlight exemplar responses (anonymously) to model strong scientific reasoning - Create small groups based on similar questions or model development needs</w:t>
+            </w:r>
+          </w:p>
+          <w:p>
+            <w:pPr>
+              <w:spacing w:before="20" w:after="20"/>
+              <w:jc w:val="left"/>
+            </w:pPr>
+            <w:r>
+              <w:rPr>
+                <w:rFonts w:ascii="Arial" w:hAnsi="Arial"/>
+                <w:b w:val="0"/>
+                <w:i w:val="0"/>
+                <w:color w:val="000000"/>
+                <w:sz w:val="18"/>
+              </w:rPr>
+              <w:t>5. Summative Preparation By Lesson 13, students should have: - A complete evidence trail supporting their final explanation - A documented progression from initial to final model - Answered their own driving questions using unit evidence</w:t>
+            </w:r>
+          </w:p>
+          <w:p>
+            <w:pPr>
+              <w:spacing w:before="20" w:after="20"/>
+              <w:jc w:val="left"/>
+            </w:pPr>
+            <w:r>
+              <w:rPr>
+                <w:rFonts w:ascii="Arial" w:hAnsi="Arial"/>
+                <w:b w:val="0"/>
+                <w:i w:val="0"/>
+                <w:color w:val="000000"/>
+                <w:sz w:val="18"/>
+              </w:rPr>
+              <w:t>This table becomes the foundation for final performance tasks, presentations, or written explanations.</w:t>
+            </w:r>
+          </w:p>
+          <w:p>
+            <w:pPr>
+              <w:spacing w:before="20" w:after="20"/>
+              <w:jc w:val="left"/>
+            </w:pPr>
+            <w:r>
+              <w:rPr>
+                <w:rFonts w:ascii="Arial" w:hAnsi="Arial"/>
+                <w:b/>
+                <w:i w:val="0"/>
+                <w:color w:val="000000"/>
+                <w:sz w:val="18"/>
+              </w:rPr>
+              <w:t>Grading Considerations</w:t>
+            </w:r>
+          </w:p>
+          <w:p>
+            <w:pPr>
+              <w:spacing w:before="20" w:after="20"/>
+              <w:jc w:val="left"/>
+            </w:pPr>
+            <w:r>
+              <w:rPr>
+                <w:rFonts w:ascii="Arial" w:hAnsi="Arial"/>
+                <w:b w:val="0"/>
+                <w:i w:val="0"/>
+                <w:color w:val="000000"/>
+                <w:sz w:val="18"/>
+              </w:rPr>
+              <w:t>This is primarily a formative tool. If grading: - Focus on completion and effort rather than correctness in early lessons - Assess growth and sophistication from Lesson 1 to Lesson 13 - Use reflection questions for deeper evaluation of conceptual understanding - Consider this as part of a portfolio or process grade, not a standalone assessment</w:t>
+            </w:r>
+          </w:p>
+          <w:p>
+            <w:pPr>
+              <w:spacing w:before="20" w:after="20"/>
+              <w:jc w:val="left"/>
+            </w:pPr>
+            <w:r>
+              <w:rPr>
+                <w:rFonts w:ascii="Arial" w:hAnsi="Arial"/>
+                <w:b/>
+                <w:i w:val="0"/>
+                <w:color w:val="000000"/>
+                <w:sz w:val="18"/>
+              </w:rPr>
+              <w:t>Time Management</w:t>
+            </w:r>
+          </w:p>
+          <w:p>
+            <w:pPr>
+              <w:spacing w:before="20" w:after="20"/>
+              <w:ind w:left="240"/>
+              <w:jc w:val="left"/>
+            </w:pPr>
+            <w:r>
+              <w:rPr>
+                <w:rFonts w:ascii="Arial" w:hAnsi="Arial"/>
+                <w:b w:val="0"/>
+                <w:i w:val="0"/>
+                <w:color w:val="000000"/>
+                <w:sz w:val="18"/>
+              </w:rPr>
+              <w:t>• Allow 5-10 minutes at the end of each lesson for table completion</w:t>
+            </w:r>
+          </w:p>
+          <w:p>
+            <w:pPr>
+              <w:spacing w:before="20" w:after="20"/>
+              <w:ind w:left="240"/>
+              <w:jc w:val="left"/>
+            </w:pPr>
+            <w:r>
+              <w:rPr>
+                <w:rFonts w:ascii="Arial" w:hAnsi="Arial"/>
+                <w:b w:val="0"/>
+                <w:i w:val="0"/>
+                <w:color w:val="000000"/>
+                <w:sz w:val="18"/>
+              </w:rPr>
+              <w:t>• Schedule mid-unit reflection (after Lesson 6-7) for students to review and identify patterns</w:t>
+            </w:r>
+          </w:p>
+          <w:p>
+            <w:pPr>
+              <w:spacing w:before="20" w:after="20"/>
+              <w:ind w:left="240"/>
+              <w:jc w:val="left"/>
+            </w:pPr>
+            <w:r>
+              <w:rPr>
+                <w:rFonts w:ascii="Arial" w:hAnsi="Arial"/>
+                <w:b w:val="0"/>
+                <w:i w:val="0"/>
+                <w:color w:val="000000"/>
+                <w:sz w:val="18"/>
+              </w:rPr>
+              <w:t>• Dedicate full lesson time (Lesson 13) for final synthesis and reflection questions</w:t>
+            </w:r>
+          </w:p>
+          <w:p>
+            <w:pPr>
+              <w:spacing w:before="20" w:after="20"/>
+              <w:jc w:val="left"/>
+            </w:pPr>
+            <w:r>
+              <w:rPr>
+                <w:rFonts w:ascii="Arial" w:hAnsi="Arial"/>
+                <w:b w:val="0"/>
+                <w:i w:val="0"/>
+                <w:color w:val="000000"/>
+                <w:sz w:val="18"/>
+              </w:rPr>
+              <w:t>Document Version: 1.0</w:t>
+              <w:br/>
+              <w:t>Created: 2026-04-14</w:t>
+              <w:br/>
+              <w:t>Curriculum Alignment: Grade 10 Chemistry, Sub-Strand 1.4 — Chemical Bonding</w:t>
+              <w:br/>
+              <w:t>Standards Alignment: NGSS HS-PS1-1, HS-PS1-3, HS-PS2-6</w:t>
+            </w:r>
+          </w:p>
+        </w:tc>
+      </w:tr>
+    </w:tbl>
     <w:sectPr>
       <w:pgSz w:w="15840" w:h="12240"/>
       <w:pgMar w:top="1080" w:right="1080" w:bottom="1080" w:left="1080" w:header="720" w:footer="720" w:gutter="0"/>

</xml_diff>